<commit_message>
Updated and submitted ShortHW2
</commit_message>
<xml_diff>
--- a/HW2_short/213382104.docx
+++ b/HW2_short/213382104.docx
@@ -9216,21 +9216,6 @@
         <w:tabs>
           <w:tab w:val="right" w:pos="9135"/>
         </w:tabs>
-        <w:ind w:left="720"/>
-        <w:rPr>
-          <w:rFonts w:ascii="Consolas" w:hAnsi="Consolas"/>
-          <w:color w:val="0070C0"/>
-          <w:sz w:val="20"/>
-          <w:szCs w:val="20"/>
-        </w:rPr>
-      </w:pPr>
-    </w:p>
-    <w:p>
-      <w:pPr>
-        <w:tabs>
-          <w:tab w:val="right" w:pos="9135"/>
-        </w:tabs>
-        <w:ind w:left="720"/>
         <w:rPr>
           <w:rFonts w:ascii="Consolas" w:hAnsi="Consolas"/>
           <w:color w:val="0070C0"/>
@@ -9333,6 +9318,20 @@
           </wp:anchor>
         </w:drawing>
       </w:r>
+    </w:p>
+    <w:p>
+      <w:pPr>
+        <w:tabs>
+          <w:tab w:val="right" w:pos="9135"/>
+        </w:tabs>
+        <w:ind w:left="720"/>
+        <w:rPr>
+          <w:rFonts w:ascii="Consolas" w:hAnsi="Consolas"/>
+          <w:color w:val="0070C0"/>
+          <w:sz w:val="20"/>
+          <w:szCs w:val="20"/>
+        </w:rPr>
+      </w:pPr>
     </w:p>
     <w:p>
       <w:pPr>
@@ -10755,6 +10754,13 @@
           <w:color w:val="00B0F0"/>
         </w:rPr>
         <w:t>Answer:</w:t>
+      </w:r>
+      <w:r>
+        <w:rPr>
+          <w:rFonts w:ascii="Assistant" w:hAnsi="Assistant" w:cs="Assistant"/>
+          <w:color w:val="00B0F0"/>
+        </w:rPr>
+        <w:t xml:space="preserve"> note that the attribute a is denoted A here. For more readability.</w:t>
       </w:r>
     </w:p>
     <w:p>
@@ -11324,6 +11330,163 @@
         </w:rPr>
         <w:t xml:space="preserve"> </w:t>
       </w:r>
+      <w:r>
+        <w:rPr>
+          <w:rFonts w:ascii="Assistant" w:hAnsi="Assistant" w:cs="Assistant"/>
+          <w:color w:val="00B0F0"/>
+        </w:rPr>
+        <w:t xml:space="preserve">(Since </w:t>
+      </w:r>
+      <m:oMath>
+        <m:d>
+          <m:dPr>
+            <m:begChr m:val="|"/>
+            <m:endChr m:val="|"/>
+            <m:ctrlPr>
+              <w:rPr>
+                <w:rFonts w:ascii="Cambria Math" w:hAnsi="Cambria Math" w:cs="Assistant"/>
+                <w:i/>
+                <w:color w:val="00B0F0"/>
+              </w:rPr>
+            </m:ctrlPr>
+          </m:dPr>
+          <m:e>
+            <m:r>
+              <w:rPr>
+                <w:rFonts w:ascii="Cambria Math" w:hAnsi="Cambria Math" w:cs="Assistant"/>
+                <w:color w:val="00B0F0"/>
+              </w:rPr>
+              <m:t>v</m:t>
+            </m:r>
+          </m:e>
+        </m:d>
+        <m:r>
+          <w:rPr>
+            <w:rFonts w:ascii="Cambria Math" w:hAnsi="Cambria Math" w:cs="Assistant"/>
+            <w:color w:val="00B0F0"/>
+          </w:rPr>
+          <m:t>=</m:t>
+        </m:r>
+        <m:r>
+          <w:rPr>
+            <w:rFonts w:ascii="Cambria Math" w:hAnsi="Cambria Math" w:cs="Assistant"/>
+          </w:rPr>
+          <m:t xml:space="preserve"> </m:t>
+        </m:r>
+        <m:r>
+          <w:rPr>
+            <w:rFonts w:ascii="Cambria Math" w:hAnsi="Cambria Math" w:cs="Assistant"/>
+            <w:color w:val="00B0F0"/>
+          </w:rPr>
+          <m:t>α</m:t>
+        </m:r>
+        <m:sSub>
+          <m:sSubPr>
+            <m:ctrlPr>
+              <w:rPr>
+                <w:rFonts w:ascii="Cambria Math" w:hAnsi="Cambria Math" w:cs="Assistant"/>
+                <w:i/>
+                <w:color w:val="00B0F0"/>
+              </w:rPr>
+            </m:ctrlPr>
+          </m:sSubPr>
+          <m:e>
+            <m:r>
+              <w:rPr>
+                <w:rFonts w:ascii="Cambria Math" w:hAnsi="Cambria Math" w:cs="Assistant"/>
+                <w:color w:val="00B0F0"/>
+              </w:rPr>
+              <m:t>β</m:t>
+            </m:r>
+          </m:e>
+          <m:sub>
+            <m:r>
+              <w:rPr>
+                <w:rFonts w:ascii="Cambria Math" w:hAnsi="Cambria Math" w:cs="Assistant"/>
+                <w:color w:val="00B0F0"/>
+              </w:rPr>
+              <m:t>1</m:t>
+            </m:r>
+          </m:sub>
+        </m:sSub>
+        <m:r>
+          <w:rPr>
+            <w:rFonts w:ascii="Cambria Math" w:hAnsi="Cambria Math" w:cs="Assistant"/>
+            <w:color w:val="00B0F0"/>
+          </w:rPr>
+          <m:t>+</m:t>
+        </m:r>
+        <m:d>
+          <m:dPr>
+            <m:ctrlPr>
+              <w:rPr>
+                <w:rFonts w:ascii="Cambria Math" w:hAnsi="Cambria Math" w:cs="Assistant"/>
+                <w:i/>
+                <w:color w:val="00B0F0"/>
+              </w:rPr>
+            </m:ctrlPr>
+          </m:dPr>
+          <m:e>
+            <m:r>
+              <w:rPr>
+                <w:rFonts w:ascii="Cambria Math" w:hAnsi="Cambria Math" w:cs="Assistant"/>
+                <w:color w:val="00B0F0"/>
+              </w:rPr>
+              <m:t>1-α</m:t>
+            </m:r>
+          </m:e>
+        </m:d>
+        <m:sSub>
+          <m:sSubPr>
+            <m:ctrlPr>
+              <w:rPr>
+                <w:rFonts w:ascii="Cambria Math" w:hAnsi="Cambria Math" w:cs="Assistant"/>
+                <w:i/>
+                <w:color w:val="00B0F0"/>
+              </w:rPr>
+            </m:ctrlPr>
+          </m:sSubPr>
+          <m:e>
+            <m:r>
+              <w:rPr>
+                <w:rFonts w:ascii="Cambria Math" w:hAnsi="Cambria Math" w:cs="Assistant"/>
+                <w:color w:val="00B0F0"/>
+              </w:rPr>
+              <m:t>β</m:t>
+            </m:r>
+          </m:e>
+          <m:sub>
+            <m:r>
+              <w:rPr>
+                <w:rFonts w:ascii="Cambria Math" w:hAnsi="Cambria Math" w:cs="Assistant"/>
+                <w:color w:val="00B0F0"/>
+              </w:rPr>
+              <m:t>2</m:t>
+            </m:r>
+          </m:sub>
+        </m:sSub>
+      </m:oMath>
+      <w:r>
+        <w:rPr>
+          <w:rFonts w:ascii="Assistant" w:hAnsi="Assistant" w:cs="Assistant"/>
+          <w:color w:val="00B0F0"/>
+        </w:rPr>
+        <w:t xml:space="preserve">, by the above </w:t>
+      </w:r>
+      <w:r>
+        <w:rPr>
+          <w:rFonts w:ascii="Assistant" w:hAnsi="Assistant" w:cs="Assistant"/>
+          <w:color w:val="00B0F0"/>
+        </w:rPr>
+        <w:t xml:space="preserve">definitions for each value </w:t>
+      </w:r>
+      <w:r>
+        <w:rPr>
+          <w:rFonts w:ascii="Assistant" w:hAnsi="Assistant" w:cs="Assistant"/>
+          <w:color w:val="00B0F0"/>
+        </w:rPr>
+        <w:t>)</w:t>
+      </w:r>
     </w:p>
     <w:p>
       <w:pPr>
@@ -11337,41 +11500,6 @@
       </w:pPr>
       <m:oMathPara>
         <m:oMath>
-          <m:r>
-            <w:rPr>
-              <w:rFonts w:ascii="Cambria Math" w:hAnsi="Cambria Math" w:cs="Assistant"/>
-              <w:color w:val="00B0F0"/>
-            </w:rPr>
-            <m:t>H</m:t>
-          </m:r>
-          <m:d>
-            <m:dPr>
-              <m:ctrlPr>
-                <w:rPr>
-                  <w:rFonts w:ascii="Cambria Math" w:hAnsi="Cambria Math" w:cs="Assistant"/>
-                  <w:i/>
-                  <w:iCs/>
-                  <w:color w:val="00B0F0"/>
-                </w:rPr>
-              </m:ctrlPr>
-            </m:dPr>
-            <m:e>
-              <m:r>
-                <w:rPr>
-                  <w:rFonts w:ascii="Cambria Math" w:hAnsi="Cambria Math" w:cs="Assistant"/>
-                  <w:color w:val="00B0F0"/>
-                </w:rPr>
-                <m:t>v</m:t>
-              </m:r>
-            </m:e>
-          </m:d>
-          <m:r>
-            <w:rPr>
-              <w:rFonts w:ascii="Cambria Math" w:hAnsi="Cambria Math" w:cs="Assistant"/>
-              <w:color w:val="00B0F0"/>
-            </w:rPr>
-            <m:t>≥</m:t>
-          </m:r>
           <m:f>
             <m:fPr>
               <m:ctrlPr>
@@ -11651,6 +11779,34 @@
               </m:sSub>
             </m:e>
           </m:d>
+          <m:r>
+            <w:rPr>
+              <w:rFonts w:ascii="Cambria Math" w:hAnsi="Cambria Math" w:cs="Assistant"/>
+              <w:color w:val="00B0F0"/>
+            </w:rPr>
+            <m:t>≤ H</m:t>
+          </m:r>
+          <m:d>
+            <m:dPr>
+              <m:ctrlPr>
+                <w:rPr>
+                  <w:rFonts w:ascii="Cambria Math" w:hAnsi="Cambria Math" w:cs="Assistant"/>
+                  <w:i/>
+                  <w:iCs/>
+                  <w:color w:val="00B0F0"/>
+                </w:rPr>
+              </m:ctrlPr>
+            </m:dPr>
+            <m:e>
+              <m:r>
+                <w:rPr>
+                  <w:rFonts w:ascii="Cambria Math" w:hAnsi="Cambria Math" w:cs="Assistant"/>
+                  <w:color w:val="00B0F0"/>
+                </w:rPr>
+                <m:t>v</m:t>
+              </m:r>
+            </m:e>
+          </m:d>
         </m:oMath>
       </m:oMathPara>
     </w:p>
@@ -11771,7 +11927,7 @@
           <w:noProof/>
         </w:rPr>
         <w:drawing>
-          <wp:anchor distT="0" distB="0" distL="114300" distR="114300" simplePos="0" relativeHeight="251662336" behindDoc="0" locked="0" layoutInCell="1" allowOverlap="1" wp14:anchorId="20CC0A1A" wp14:editId="2E9BB305">
+          <wp:anchor distT="0" distB="0" distL="114300" distR="114300" simplePos="0" relativeHeight="251662336" behindDoc="0" locked="0" layoutInCell="1" allowOverlap="1" wp14:anchorId="20CC0A1A" wp14:editId="7EB4B652">
             <wp:simplePos x="0" y="0"/>
             <wp:positionH relativeFrom="column">
               <wp:posOffset>4448175</wp:posOffset>
@@ -13484,21 +13640,7 @@
                 <w:rFonts w:ascii="Cambria Math" w:hAnsi="Cambria Math" w:cs="Assistant"/>
                 <w:color w:val="00B0F0"/>
               </w:rPr>
-              <m:t xml:space="preserve">∀c&gt;0,  </m:t>
-            </m:r>
-            <m:r>
-              <w:rPr>
-                <w:rFonts w:ascii="Cambria Math" w:hAnsi="Cambria Math" w:cs="Assistant"/>
-                <w:color w:val="00B0F0"/>
-              </w:rPr>
-              <m:t xml:space="preserve">            </m:t>
-            </m:r>
-            <m:r>
-              <w:rPr>
-                <w:rFonts w:ascii="Cambria Math" w:hAnsi="Cambria Math" w:cs="Assistant"/>
-                <w:color w:val="00B0F0"/>
-              </w:rPr>
-              <m:t>w</m:t>
+              <m:t>∀c&gt;0,              w</m:t>
             </m:r>
           </m:e>
           <m:sup>
@@ -15937,16 +16079,27 @@
                 <w:sz w:val="18"/>
                 <w:szCs w:val="18"/>
               </w:rPr>
-              <w:t>Yes</w:t>
+              <w:t>No.</w:t>
             </w:r>
-            <w:r>
+          </w:p>
+          <w:p>
+            <w:pPr>
+              <w:pStyle w:val="Normal0"/>
               <w:rPr>
                 <w:rFonts w:ascii="Assistant" w:hAnsi="Assistant" w:cs="Assistant"/>
                 <w:color w:val="00B0F0"/>
                 <w:sz w:val="18"/>
                 <w:szCs w:val="18"/>
               </w:rPr>
-              <w:t>.</w:t>
+            </w:pPr>
+            <w:r>
+              <w:rPr>
+                <w:rFonts w:ascii="Assistant" w:hAnsi="Assistant" w:cs="Assistant"/>
+                <w:color w:val="00B0F0"/>
+                <w:sz w:val="18"/>
+                <w:szCs w:val="18"/>
+              </w:rPr>
+              <w:t>Because of the center point being red but closest to a blue point.</w:t>
             </w:r>
           </w:p>
         </w:tc>
@@ -16209,34 +16362,7 @@
                 <w:sz w:val="18"/>
                 <w:szCs w:val="18"/>
               </w:rPr>
-              <w:t xml:space="preserve">since </w:t>
-            </w:r>
-            <w:r>
-              <w:rPr>
-                <w:rFonts w:ascii="Assistant" w:hAnsi="Assistant" w:cs="Assistant"/>
-                <w:color w:val="00B0F0"/>
-                <w:sz w:val="18"/>
-                <w:szCs w:val="18"/>
-              </w:rPr>
-              <w:t xml:space="preserve"> the center point </w:t>
-            </w:r>
-            <w:r>
-              <w:rPr>
-                <w:rFonts w:ascii="Assistant" w:hAnsi="Assistant" w:cs="Assistant"/>
-                <w:color w:val="00B0F0"/>
-                <w:sz w:val="18"/>
-                <w:szCs w:val="18"/>
-              </w:rPr>
-              <w:t>is</w:t>
-            </w:r>
-            <w:r>
-              <w:rPr>
-                <w:rFonts w:ascii="Assistant" w:hAnsi="Assistant" w:cs="Assistant"/>
-                <w:color w:val="00B0F0"/>
-                <w:sz w:val="18"/>
-                <w:szCs w:val="18"/>
-              </w:rPr>
-              <w:t xml:space="preserve"> blue but closest to a red point.</w:t>
+              <w:t>since  the center point is blue but closest to a red point.</w:t>
             </w:r>
           </w:p>
         </w:tc>
@@ -17357,6 +17483,99 @@
           <w:rFonts w:ascii="Assistant" w:hAnsi="Assistant" w:cs="Assistant"/>
           <w:iCs/>
           <w:color w:val="00B0F0"/>
+        </w:rPr>
+      </w:pPr>
+      <w:r>
+        <w:rPr>
+          <w:rFonts w:ascii="Assistant" w:hAnsi="Assistant" w:cs="Assistant"/>
+          <w:iCs/>
+          <w:color w:val="00B0F0"/>
+        </w:rPr>
+        <w:t xml:space="preserve">A change may occur. For example ,incase of dataset A, if we rotate the points such that the </w:t>
+      </w:r>
+      <w:r>
+        <w:rPr>
+          <w:rFonts w:ascii="Assistant" w:hAnsi="Assistant" w:cs="Assistant"/>
+          <w:iCs/>
+          <w:color w:val="00B0F0"/>
+          <w:u w:val="single"/>
+        </w:rPr>
+        <w:t>blue point</w:t>
+      </w:r>
+      <w:r>
+        <w:rPr>
+          <w:rFonts w:ascii="Assistant" w:hAnsi="Assistant" w:cs="Assistant"/>
+          <w:iCs/>
+          <w:color w:val="00B0F0"/>
+        </w:rPr>
+        <w:t xml:space="preserve"> in (-,2,2) would be on the y axis</w:t>
+      </w:r>
+      <w:r>
+        <w:rPr>
+          <w:rFonts w:ascii="Assistant" w:hAnsi="Assistant" w:cs="Assistant"/>
+          <w:iCs/>
+          <w:color w:val="00B0F0"/>
+        </w:rPr>
+        <w:t xml:space="preserve"> </w:t>
+      </w:r>
+      <w:r>
+        <w:rPr>
+          <w:rFonts w:ascii="Assistant" w:hAnsi="Assistant" w:cs="Assistant"/>
+          <w:iCs/>
+          <w:color w:val="00B0F0"/>
+        </w:rPr>
+        <w:t xml:space="preserve">we will get a miss classification for the center </w:t>
+      </w:r>
+      <w:r>
+        <w:rPr>
+          <w:rFonts w:ascii="Assistant" w:hAnsi="Assistant" w:cs="Assistant"/>
+          <w:iCs/>
+          <w:color w:val="00B0F0"/>
+          <w:u w:val="single"/>
+        </w:rPr>
+        <w:t>red point</w:t>
+      </w:r>
+      <w:r>
+        <w:rPr>
+          <w:rFonts w:ascii="Assistant" w:hAnsi="Assistant" w:cs="Assistant"/>
+          <w:iCs/>
+          <w:color w:val="00B0F0"/>
+          <w:u w:val="single"/>
+        </w:rPr>
+        <w:t>.</w:t>
+      </w:r>
+    </w:p>
+    <w:p>
+      <w:pPr>
+        <w:pStyle w:val="ListParagraph"/>
+        <w:spacing w:after="0" w:line="360" w:lineRule="auto"/>
+        <w:ind w:left="2880"/>
+        <w:jc w:val="both"/>
+        <w:rPr>
+          <w:rFonts w:ascii="Assistant" w:hAnsi="Assistant" w:cs="Assistant"/>
+          <w:iCs/>
+          <w:color w:val="00B0F0"/>
+        </w:rPr>
+      </w:pPr>
+      <w:r>
+        <w:rPr>
+          <w:rFonts w:ascii="Assistant" w:hAnsi="Assistant" w:cs="Assistant"/>
+          <w:iCs/>
+          <w:color w:val="00B0F0"/>
+        </w:rPr>
+        <w:t>Similarly for data set B, rotating the data set by 45 degrees may change the classification of the center point  and the red point that was in (0,-2) originally, resulting in  perfect accuracy.</w:t>
+      </w:r>
+    </w:p>
+    <w:p>
+      <w:pPr>
+        <w:pStyle w:val="ListParagraph"/>
+        <w:spacing w:after="0" w:line="360" w:lineRule="auto"/>
+        <w:ind w:left="2880"/>
+        <w:jc w:val="both"/>
+        <w:rPr>
+          <w:rFonts w:ascii="Assistant" w:hAnsi="Assistant" w:cs="Assistant"/>
+          <w:iCs/>
+          <w:color w:val="00B0F0"/>
           <w:rtl/>
         </w:rPr>
       </w:pPr>
@@ -17366,42 +17585,7 @@
           <w:iCs/>
           <w:color w:val="00B0F0"/>
         </w:rPr>
-        <w:t xml:space="preserve">A change may occur. For example ,incase of dataset A, if we rotate the points such that the </w:t>
-      </w:r>
-      <w:r>
-        <w:rPr>
-          <w:rFonts w:ascii="Assistant" w:hAnsi="Assistant" w:cs="Assistant"/>
-          <w:iCs/>
-          <w:color w:val="00B0F0"/>
-          <w:u w:val="single"/>
-        </w:rPr>
-        <w:t>blue point</w:t>
-      </w:r>
-      <w:r>
-        <w:rPr>
-          <w:rFonts w:ascii="Assistant" w:hAnsi="Assistant" w:cs="Assistant"/>
-          <w:iCs/>
-          <w:color w:val="00B0F0"/>
-        </w:rPr>
-        <w:t xml:space="preserve"> in (-,2,2) would be on the y axis, meaning on (0,2*sqrt(2)), we will get a miss classification for the center </w:t>
-      </w:r>
-      <w:r>
-        <w:rPr>
-          <w:rFonts w:ascii="Assistant" w:hAnsi="Assistant" w:cs="Assistant"/>
-          <w:iCs/>
-          <w:color w:val="00B0F0"/>
-          <w:u w:val="single"/>
-        </w:rPr>
-        <w:t>red point</w:t>
-      </w:r>
-      <w:r>
-        <w:rPr>
-          <w:rFonts w:ascii="Assistant" w:hAnsi="Assistant" w:cs="Assistant"/>
-          <w:iCs/>
-          <w:color w:val="00B0F0"/>
-          <w:u w:val="single"/>
-        </w:rPr>
-        <w:t>.</w:t>
+        <w:t>All in all, the model might change from fitting A perfectly and not B, to fit B perfectly and not A</w:t>
       </w:r>
     </w:p>
     <w:sectPr>

</xml_diff>